<commit_message>
docs: Update Milestone 2 document with references and enhanced explanations
</commit_message>
<xml_diff>
--- a/Docs/Dishank Project Milestone 2.docx
+++ b/Docs/Dishank Project Milestone 2.docx
@@ -175,7 +175,42 @@
     </w:p>
     <w:p>
       <w:r>
-        <w:t>The transition from manual warehouses to automated, robotics-driven logistics relies heavily on intelligent routing. While finding the optimal path for a single robot is a mathematically trivial search problem, coordinating hundreds of cooperative, autonomous vehicles in a shared physical space is computationally intractable.</w:t>
+        <w:t>The transition from manual warehouses to automated, robotics-driven logistics relies heavily on intelligent routing</w:t>
+      </w:r>
+      <w:r>
+        <w:t xml:space="preserve"> </w:t>
+      </w:r>
+      <w:r>
+        <w:t>[2]</w:t>
+      </w:r>
+      <w:r>
+        <w:t>. While finding the optimal path for a single robot is a mathematically trivial search problem</w:t>
+      </w:r>
+      <w:r>
+        <w:t xml:space="preserve"> </w:t>
+      </w:r>
+      <w:r>
+        <w:t>[1]</w:t>
+      </w:r>
+      <w:r>
+        <w:t xml:space="preserve">, coordinating hundreds of cooperative, autonomous vehicles in a shared physical space is computationally </w:t>
+      </w:r>
+      <w:proofErr w:type="gramStart"/>
+      <w:r>
+        <w:t>intractable</w:t>
+      </w:r>
+      <w:r>
+        <w:t>[</w:t>
+      </w:r>
+      <w:proofErr w:type="gramEnd"/>
+      <w:r>
+        <w:t>5</w:t>
+      </w:r>
+      <w:r>
+        <w:t>]</w:t>
+      </w:r>
+      <w:r>
+        <w:t>.</w:t>
       </w:r>
     </w:p>
     <w:p>
@@ -325,7 +360,23 @@
           <w:i/>
           <w:iCs/>
         </w:rPr>
-        <w:t>), … , (</w:t>
+        <w:t xml:space="preserve">), </w:t>
+      </w:r>
+      <w:proofErr w:type="gramStart"/>
+      <w:r>
+        <w:rPr>
+          <w:i/>
+          <w:iCs/>
+        </w:rPr>
+        <w:t>… ,</w:t>
+      </w:r>
+      <w:proofErr w:type="gramEnd"/>
+      <w:r>
+        <w:rPr>
+          <w:i/>
+          <w:iCs/>
+        </w:rPr>
+        <w:t xml:space="preserve"> (</w:t>
       </w:r>
       <w:proofErr w:type="spellStart"/>
       <w:r>
@@ -390,6 +441,7 @@
         </w:rPr>
         <w:t>, p</w:t>
       </w:r>
+      <w:proofErr w:type="gramStart"/>
       <w:r>
         <w:rPr>
           <w:i/>
@@ -403,7 +455,15 @@
           <w:i/>
           <w:iCs/>
         </w:rPr>
-        <w:t>,  ... , p</w:t>
+        <w:t>,  ...</w:t>
+      </w:r>
+      <w:proofErr w:type="gramEnd"/>
+      <w:r>
+        <w:rPr>
+          <w:i/>
+          <w:iCs/>
+        </w:rPr>
+        <w:t xml:space="preserve"> , p</w:t>
       </w:r>
       <w:r>
         <w:rPr>
@@ -774,7 +834,21 @@
         <w:rPr>
           <w:rFonts w:ascii="Consolas" w:hAnsi="Consolas"/>
         </w:rPr>
-        <w:t>__(self, position, parent=None):</w:t>
+        <w:t>_</w:t>
+      </w:r>
+      <w:proofErr w:type="gramStart"/>
+      <w:r>
+        <w:rPr>
+          <w:rFonts w:ascii="Consolas" w:hAnsi="Consolas"/>
+        </w:rPr>
+        <w:t>_(</w:t>
+      </w:r>
+      <w:proofErr w:type="gramEnd"/>
+      <w:r>
+        <w:rPr>
+          <w:rFonts w:ascii="Consolas" w:hAnsi="Consolas"/>
+        </w:rPr>
+        <w:t>self, position, parent=None):</w:t>
       </w:r>
     </w:p>
     <w:p>
@@ -791,6 +865,7 @@
         <w:t xml:space="preserve">        </w:t>
       </w:r>
       <w:proofErr w:type="spellStart"/>
+      <w:proofErr w:type="gramStart"/>
       <w:r>
         <w:rPr>
           <w:rFonts w:ascii="Consolas" w:hAnsi="Consolas"/>
@@ -798,6 +873,7 @@
         <w:t>self.position</w:t>
       </w:r>
       <w:proofErr w:type="spellEnd"/>
+      <w:proofErr w:type="gramEnd"/>
       <w:r>
         <w:rPr>
           <w:rFonts w:ascii="Consolas" w:hAnsi="Consolas"/>
@@ -819,6 +895,7 @@
         <w:t xml:space="preserve">        </w:t>
       </w:r>
       <w:proofErr w:type="spellStart"/>
+      <w:proofErr w:type="gramStart"/>
       <w:r>
         <w:rPr>
           <w:rFonts w:ascii="Consolas" w:hAnsi="Consolas"/>
@@ -826,6 +903,7 @@
         <w:t>self.parent</w:t>
       </w:r>
       <w:proofErr w:type="spellEnd"/>
+      <w:proofErr w:type="gramEnd"/>
       <w:r>
         <w:rPr>
           <w:rFonts w:ascii="Consolas" w:hAnsi="Consolas"/>
@@ -847,6 +925,7 @@
         <w:t xml:space="preserve">        </w:t>
       </w:r>
       <w:proofErr w:type="spellStart"/>
+      <w:proofErr w:type="gramStart"/>
       <w:r>
         <w:rPr>
           <w:rFonts w:ascii="Consolas" w:hAnsi="Consolas"/>
@@ -854,6 +933,7 @@
         <w:t>self.g</w:t>
       </w:r>
       <w:proofErr w:type="spellEnd"/>
+      <w:proofErr w:type="gramEnd"/>
       <w:r>
         <w:rPr>
           <w:rFonts w:ascii="Consolas" w:hAnsi="Consolas"/>
@@ -903,6 +983,7 @@
         <w:t xml:space="preserve">        </w:t>
       </w:r>
       <w:proofErr w:type="spellStart"/>
+      <w:proofErr w:type="gramStart"/>
       <w:r>
         <w:rPr>
           <w:rFonts w:ascii="Consolas" w:hAnsi="Consolas"/>
@@ -910,6 +991,7 @@
         <w:t>self.f</w:t>
       </w:r>
       <w:proofErr w:type="spellEnd"/>
+      <w:proofErr w:type="gramEnd"/>
       <w:r>
         <w:rPr>
           <w:rFonts w:ascii="Consolas" w:hAnsi="Consolas"/>
@@ -956,7 +1038,21 @@
         <w:rPr>
           <w:rFonts w:ascii="Consolas" w:hAnsi="Consolas"/>
         </w:rPr>
-        <w:t>__(self, other):</w:t>
+        <w:t>_</w:t>
+      </w:r>
+      <w:proofErr w:type="gramStart"/>
+      <w:r>
+        <w:rPr>
+          <w:rFonts w:ascii="Consolas" w:hAnsi="Consolas"/>
+        </w:rPr>
+        <w:t>_(</w:t>
+      </w:r>
+      <w:proofErr w:type="gramEnd"/>
+      <w:r>
+        <w:rPr>
+          <w:rFonts w:ascii="Consolas" w:hAnsi="Consolas"/>
+        </w:rPr>
+        <w:t>self, other):</w:t>
       </w:r>
     </w:p>
     <w:p>
@@ -973,6 +1069,7 @@
         <w:t xml:space="preserve">        return </w:t>
       </w:r>
       <w:proofErr w:type="spellStart"/>
+      <w:proofErr w:type="gramStart"/>
       <w:r>
         <w:rPr>
           <w:rFonts w:ascii="Consolas" w:hAnsi="Consolas"/>
@@ -980,6 +1077,7 @@
         <w:t>self.position</w:t>
       </w:r>
       <w:proofErr w:type="spellEnd"/>
+      <w:proofErr w:type="gramEnd"/>
       <w:r>
         <w:rPr>
           <w:rFonts w:ascii="Consolas" w:hAnsi="Consolas"/>
@@ -987,6 +1085,7 @@
         <w:t xml:space="preserve"> == </w:t>
       </w:r>
       <w:proofErr w:type="spellStart"/>
+      <w:proofErr w:type="gramStart"/>
       <w:r>
         <w:rPr>
           <w:rFonts w:ascii="Consolas" w:hAnsi="Consolas"/>
@@ -994,6 +1093,7 @@
         <w:t>other.position</w:t>
       </w:r>
       <w:proofErr w:type="spellEnd"/>
+      <w:proofErr w:type="gramEnd"/>
     </w:p>
     <w:p>
       <w:pPr>
@@ -1028,7 +1128,21 @@
         <w:rPr>
           <w:rFonts w:ascii="Consolas" w:hAnsi="Consolas"/>
         </w:rPr>
-        <w:t>__(self, other):</w:t>
+        <w:t>_</w:t>
+      </w:r>
+      <w:proofErr w:type="gramStart"/>
+      <w:r>
+        <w:rPr>
+          <w:rFonts w:ascii="Consolas" w:hAnsi="Consolas"/>
+        </w:rPr>
+        <w:t>_(</w:t>
+      </w:r>
+      <w:proofErr w:type="gramEnd"/>
+      <w:r>
+        <w:rPr>
+          <w:rFonts w:ascii="Consolas" w:hAnsi="Consolas"/>
+        </w:rPr>
+        <w:t>self, other):</w:t>
       </w:r>
     </w:p>
     <w:p>
@@ -1045,6 +1159,7 @@
         <w:t xml:space="preserve">        return </w:t>
       </w:r>
       <w:proofErr w:type="spellStart"/>
+      <w:proofErr w:type="gramStart"/>
       <w:r>
         <w:rPr>
           <w:rFonts w:ascii="Consolas" w:hAnsi="Consolas"/>
@@ -1052,6 +1167,7 @@
         <w:t>self.f</w:t>
       </w:r>
       <w:proofErr w:type="spellEnd"/>
+      <w:proofErr w:type="gramEnd"/>
       <w:r>
         <w:rPr>
           <w:rFonts w:ascii="Consolas" w:hAnsi="Consolas"/>
@@ -1059,6 +1175,7 @@
         <w:t xml:space="preserve"> &lt; </w:t>
       </w:r>
       <w:proofErr w:type="spellStart"/>
+      <w:proofErr w:type="gramStart"/>
       <w:r>
         <w:rPr>
           <w:rFonts w:ascii="Consolas" w:hAnsi="Consolas"/>
@@ -1066,6 +1183,7 @@
         <w:t>other.f</w:t>
       </w:r>
       <w:proofErr w:type="spellEnd"/>
+      <w:proofErr w:type="gramEnd"/>
     </w:p>
     <w:p>
       <w:pPr>
@@ -1092,8 +1210,41 @@
     </w:p>
     <w:p>
       <w:r>
-        <w:t>To establish a performance baseline, I implemented a standard A* search algorithm. In a multi-agent scenario, this acts as a "decoupled" approach where robots calculate their paths independently.</w:t>
-      </w:r>
+        <w:t xml:space="preserve">To establish a performance baseline, I implemented a standard A* search </w:t>
+      </w:r>
+      <w:proofErr w:type="gramStart"/>
+      <w:r>
+        <w:t>algorithm</w:t>
+      </w:r>
+      <w:r>
+        <w:t>[</w:t>
+      </w:r>
+      <w:proofErr w:type="gramEnd"/>
+      <w:r>
+        <w:t>1]</w:t>
+      </w:r>
+      <w:r>
+        <w:t>. In a multi-agent scenario, this acts as a "decoupled" approach where robots calculate their paths independently</w:t>
+      </w:r>
+      <w:r>
+        <w:t xml:space="preserve">, </w:t>
+      </w:r>
+      <w:proofErr w:type="gramStart"/>
+      <w:r>
+        <w:t>similar to</w:t>
+      </w:r>
+      <w:proofErr w:type="gramEnd"/>
+      <w:r>
+        <w:t xml:space="preserve"> early prioritized planning methods [3</w:t>
+      </w:r>
+      <w:proofErr w:type="gramStart"/>
+      <w:r>
+        <w:t>].</w:t>
+      </w:r>
+      <w:r>
+        <w:t>.</w:t>
+      </w:r>
+      <w:proofErr w:type="gramEnd"/>
     </w:p>
     <w:p>
       <w:r>
@@ -1107,7 +1258,15 @@
         <w:t>h(n)</w:t>
       </w:r>
       <w:r>
-        <w:t xml:space="preserve"> calculation: h(n) = </w:t>
+        <w:t xml:space="preserve"> calculation: </w:t>
+      </w:r>
+    </w:p>
+    <w:p>
+      <w:pPr>
+        <w:jc w:val="center"/>
+      </w:pPr>
+      <w:r>
+        <w:t xml:space="preserve">h(n) = </w:t>
       </w:r>
       <w:r>
         <w:rPr>
@@ -1176,8 +1335,10 @@
         </w:rPr>
         <w:t>|.</w:t>
       </w:r>
-      <w:r>
-        <w:t xml:space="preserve"> This guarantees the heuristic is both admissible (it never overestimates the true cost) and consistent (it satisfies the triangle inequality).</w:t>
+    </w:p>
+    <w:p>
+      <w:r>
+        <w:t>This guarantees the heuristic is both admissible (it never overestimates the true cost) and consistent (it satisfies the triangle inequality).</w:t>
       </w:r>
     </w:p>
     <w:p>
@@ -1266,6 +1427,7 @@
         </w:numPr>
       </w:pPr>
       <w:r>
+        <w:lastRenderedPageBreak/>
         <w:t xml:space="preserve">For each valid </w:t>
       </w:r>
       <w:proofErr w:type="spellStart"/>
@@ -1292,7 +1454,6 @@
           <w:iCs/>
           <w:noProof/>
         </w:rPr>
-        <w:lastRenderedPageBreak/>
         <w:drawing>
           <wp:inline distT="0" distB="0" distL="0" distR="0" wp14:anchorId="4417FC70" wp14:editId="3C793B6C">
             <wp:extent cx="3443709" cy="2647950"/>
@@ -1390,7 +1551,15 @@
     </w:p>
     <w:p>
       <w:r>
-        <w:t>While the A* baseline operates efficiently for a single agent, it is mathematically insufficient for a true MAPF problem. If two agents plan intersecting routes independently, collisions are guaranteed. To guarantee an optimal Sum of Costs (SOC) for multiple agents without collisions, my project implements a coupled approach known as Conflict-Based Search (CBS).</w:t>
+        <w:t xml:space="preserve">While the A* baseline operates efficiently for a single agent, it is mathematically insufficient for a true MAPF problem. </w:t>
+      </w:r>
+      <w:proofErr w:type="spellStart"/>
+      <w:r>
+        <w:t>Standley</w:t>
+      </w:r>
+      <w:proofErr w:type="spellEnd"/>
+      <w:r>
+        <w:t xml:space="preserve"> formally proved that such decoupled algorithms are inherently suboptimal and often fail to find solutions in dense environments due to cascading deadlocks [4]. To guarantee an optimal Sum of Costs (SOC) for multiple agents without collisions, my project implements a coupled approach known as Conflict-Based Search (CBS) [5].</w:t>
       </w:r>
     </w:p>
     <w:p>
@@ -1459,12 +1628,12 @@
     </w:p>
     <w:p>
       <w:r>
+        <w:lastRenderedPageBreak/>
         <w:t>For Milestone 2, I have successfully scaffolded this high-level architecture to prepare for full algorithmic integration. The data structures required to hold the constraint realities are established in the codebase:</w:t>
       </w:r>
     </w:p>
     <w:p>
       <w:r>
-        <w:lastRenderedPageBreak/>
         <w:t>Python</w:t>
       </w:r>
     </w:p>
@@ -1538,6 +1707,7 @@
         <w:t xml:space="preserve">        </w:t>
       </w:r>
       <w:proofErr w:type="spellStart"/>
+      <w:proofErr w:type="gramStart"/>
       <w:r>
         <w:rPr>
           <w:rFonts w:ascii="Consolas" w:hAnsi="Consolas"/>
@@ -1545,6 +1715,7 @@
         <w:t>self.constraints</w:t>
       </w:r>
       <w:proofErr w:type="spellEnd"/>
+      <w:proofErr w:type="gramEnd"/>
       <w:r>
         <w:rPr>
           <w:rFonts w:ascii="Consolas" w:hAnsi="Consolas"/>
@@ -1580,6 +1751,7 @@
         <w:t xml:space="preserve">        </w:t>
       </w:r>
       <w:proofErr w:type="spellStart"/>
+      <w:proofErr w:type="gramStart"/>
       <w:r>
         <w:rPr>
           <w:rFonts w:ascii="Consolas" w:hAnsi="Consolas"/>
@@ -1587,11 +1759,26 @@
         <w:t>self.solution</w:t>
       </w:r>
       <w:proofErr w:type="spellEnd"/>
+      <w:proofErr w:type="gramEnd"/>
       <w:r>
         <w:rPr>
           <w:rFonts w:ascii="Consolas" w:hAnsi="Consolas"/>
         </w:rPr>
-        <w:t xml:space="preserve"> = {}    # Dictionary of current optimal paths for all agents</w:t>
+        <w:t xml:space="preserve"> = </w:t>
+      </w:r>
+      <w:proofErr w:type="gramStart"/>
+      <w:r>
+        <w:rPr>
+          <w:rFonts w:ascii="Consolas" w:hAnsi="Consolas"/>
+        </w:rPr>
+        <w:t xml:space="preserve">{}   </w:t>
+      </w:r>
+      <w:proofErr w:type="gramEnd"/>
+      <w:r>
+        <w:rPr>
+          <w:rFonts w:ascii="Consolas" w:hAnsi="Consolas"/>
+        </w:rPr>
+        <w:t xml:space="preserve"> # Dictionary of current optimal paths for all agents</w:t>
       </w:r>
     </w:p>
     <w:p>
@@ -1608,6 +1795,7 @@
         <w:t xml:space="preserve">        </w:t>
       </w:r>
       <w:proofErr w:type="spellStart"/>
+      <w:proofErr w:type="gramStart"/>
       <w:r>
         <w:rPr>
           <w:rFonts w:ascii="Consolas" w:hAnsi="Consolas"/>
@@ -1615,6 +1803,7 @@
         <w:t>self.cost</w:t>
       </w:r>
       <w:proofErr w:type="spellEnd"/>
+      <w:proofErr w:type="gramEnd"/>
       <w:r>
         <w:rPr>
           <w:rFonts w:ascii="Consolas" w:hAnsi="Consolas"/>
@@ -1661,7 +1850,21 @@
         <w:rPr>
           <w:rFonts w:ascii="Consolas" w:hAnsi="Consolas"/>
         </w:rPr>
-        <w:t>__(self, other):</w:t>
+        <w:t>_</w:t>
+      </w:r>
+      <w:proofErr w:type="gramStart"/>
+      <w:r>
+        <w:rPr>
+          <w:rFonts w:ascii="Consolas" w:hAnsi="Consolas"/>
+        </w:rPr>
+        <w:t>_(</w:t>
+      </w:r>
+      <w:proofErr w:type="gramEnd"/>
+      <w:r>
+        <w:rPr>
+          <w:rFonts w:ascii="Consolas" w:hAnsi="Consolas"/>
+        </w:rPr>
+        <w:t>self, other):</w:t>
       </w:r>
     </w:p>
     <w:p>
@@ -1692,6 +1895,7 @@
         <w:t xml:space="preserve">        return </w:t>
       </w:r>
       <w:proofErr w:type="spellStart"/>
+      <w:proofErr w:type="gramStart"/>
       <w:r>
         <w:rPr>
           <w:rFonts w:ascii="Consolas" w:hAnsi="Consolas"/>
@@ -1699,6 +1903,7 @@
         <w:t>self.cost</w:t>
       </w:r>
       <w:proofErr w:type="spellEnd"/>
+      <w:proofErr w:type="gramEnd"/>
       <w:r>
         <w:rPr>
           <w:rFonts w:ascii="Consolas" w:hAnsi="Consolas"/>
@@ -1706,6 +1911,7 @@
         <w:t xml:space="preserve"> &lt; </w:t>
       </w:r>
       <w:proofErr w:type="spellStart"/>
+      <w:proofErr w:type="gramStart"/>
       <w:r>
         <w:rPr>
           <w:rFonts w:ascii="Consolas" w:hAnsi="Consolas"/>
@@ -1713,6 +1919,7 @@
         <w:t>other.cost</w:t>
       </w:r>
       <w:proofErr w:type="spellEnd"/>
+      <w:proofErr w:type="gramEnd"/>
     </w:p>
     <w:p>
       <w:pPr>
@@ -1799,10 +2006,22 @@
           <w:i/>
           <w:iCs/>
         </w:rPr>
-        <w:t>Baseline A:</w:t>
-      </w:r>
-      <w:r>
-        <w:t>* Reached the goal in exactly 18 steps consistently.</w:t>
+        <w:t xml:space="preserve">Baseline </w:t>
+      </w:r>
+      <w:proofErr w:type="gramStart"/>
+      <w:r>
+        <w:rPr>
+          <w:i/>
+          <w:iCs/>
+        </w:rPr>
+        <w:t>A:</w:t>
+      </w:r>
+      <w:r>
+        <w:t>*</w:t>
+      </w:r>
+      <w:proofErr w:type="gramEnd"/>
+      <w:r>
+        <w:t xml:space="preserve"> Reached the goal in exactly 18 steps consistently.</w:t>
       </w:r>
     </w:p>
     <w:p>
@@ -1816,12 +2035,12 @@
           <w:b/>
           <w:bCs/>
         </w:rPr>
+        <w:lastRenderedPageBreak/>
         <w:t>6.2 Experiment 2: Dimensional Performance Scaling</w:t>
       </w:r>
     </w:p>
     <w:p>
       <w:r>
-        <w:lastRenderedPageBreak/>
         <w:t>To establish a control metric for future scaling enhancements, the baseline A* agent was tasked with navigating empty grids of exponentially increasing sizes from the top-left to the bottom-right coordinate.</w:t>
       </w:r>
     </w:p>
@@ -1967,8 +2186,17 @@
           <w:sz w:val="20"/>
           <w:szCs w:val="20"/>
         </w:rPr>
-        <w:t xml:space="preserve"> algorithm across varying grid dimensions.*</w:t>
-      </w:r>
+        <w:t xml:space="preserve"> algorithm across varying grid </w:t>
+      </w:r>
+      <w:proofErr w:type="gramStart"/>
+      <w:r>
+        <w:rPr>
+          <w:sz w:val="20"/>
+          <w:szCs w:val="20"/>
+        </w:rPr>
+        <w:t>dimensions.*</w:t>
+      </w:r>
+      <w:proofErr w:type="gramEnd"/>
     </w:p>
     <w:p>
       <w:pPr>
@@ -1997,78 +2225,382 @@
         <w:t>.</w:t>
       </w:r>
     </w:p>
-    <w:p>
-      <w:pPr>
-        <w:numPr>
-          <w:ilvl w:val="0"/>
-          <w:numId w:val="41"/>
-        </w:numPr>
-      </w:pPr>
-      <w:r>
+    <w:tbl>
+      <w:tblPr>
+        <w:tblW w:w="0" w:type="auto"/>
+        <w:tblCellSpacing w:w="15" w:type="dxa"/>
+        <w:tblCellMar>
+          <w:left w:w="0" w:type="dxa"/>
+          <w:right w:w="0" w:type="dxa"/>
+        </w:tblCellMar>
+        <w:tblLook w:val="04A0" w:firstRow="1" w:lastRow="0" w:firstColumn="1" w:lastColumn="0" w:noHBand="0" w:noVBand="1"/>
+      </w:tblPr>
+      <w:tblGrid>
+        <w:gridCol w:w="2127"/>
+        <w:gridCol w:w="2461"/>
+        <w:gridCol w:w="2881"/>
+      </w:tblGrid>
+      <w:tr>
+        <w:trPr>
+          <w:tblHeader/>
+          <w:tblCellSpacing w:w="15" w:type="dxa"/>
+        </w:trPr>
+        <w:tc>
+          <w:tcPr>
+            <w:tcW w:w="0" w:type="auto"/>
+            <w:tcBorders>
+              <w:top w:val="single" w:sz="6" w:space="0" w:color="auto"/>
+              <w:left w:val="single" w:sz="6" w:space="0" w:color="auto"/>
+              <w:bottom w:val="single" w:sz="6" w:space="0" w:color="auto"/>
+              <w:right w:val="single" w:sz="6" w:space="0" w:color="auto"/>
+            </w:tcBorders>
+            <w:tcMar>
+              <w:top w:w="240" w:type="dxa"/>
+              <w:left w:w="0" w:type="dxa"/>
+              <w:bottom w:w="240" w:type="dxa"/>
+              <w:right w:w="180" w:type="dxa"/>
+            </w:tcMar>
+            <w:vAlign w:val="center"/>
+            <w:hideMark/>
+          </w:tcPr>
+          <w:p>
+            <w:r>
+              <w:rPr>
+                <w:b/>
+                <w:bCs/>
+              </w:rPr>
+              <w:t>Obstacle Density</w:t>
+            </w:r>
+          </w:p>
+        </w:tc>
+        <w:tc>
+          <w:tcPr>
+            <w:tcW w:w="0" w:type="auto"/>
+            <w:tcBorders>
+              <w:top w:val="single" w:sz="6" w:space="0" w:color="auto"/>
+              <w:left w:val="single" w:sz="6" w:space="0" w:color="auto"/>
+              <w:bottom w:val="single" w:sz="6" w:space="0" w:color="auto"/>
+              <w:right w:val="single" w:sz="6" w:space="0" w:color="auto"/>
+            </w:tcBorders>
+            <w:tcMar>
+              <w:top w:w="240" w:type="dxa"/>
+              <w:left w:w="0" w:type="dxa"/>
+              <w:bottom w:w="240" w:type="dxa"/>
+              <w:right w:w="180" w:type="dxa"/>
+            </w:tcMar>
+            <w:vAlign w:val="center"/>
+            <w:hideMark/>
+          </w:tcPr>
+          <w:p>
+            <w:r>
+              <w:rPr>
+                <w:b/>
+                <w:bCs/>
+              </w:rPr>
+              <w:t>Optimal Path Length</w:t>
+            </w:r>
+          </w:p>
+        </w:tc>
+        <w:tc>
+          <w:tcPr>
+            <w:tcW w:w="0" w:type="auto"/>
+            <w:tcBorders>
+              <w:top w:val="single" w:sz="6" w:space="0" w:color="auto"/>
+              <w:left w:val="single" w:sz="6" w:space="0" w:color="auto"/>
+              <w:bottom w:val="single" w:sz="6" w:space="0" w:color="auto"/>
+              <w:right w:val="single" w:sz="6" w:space="0" w:color="auto"/>
+            </w:tcBorders>
+            <w:tcMar>
+              <w:top w:w="240" w:type="dxa"/>
+              <w:left w:w="0" w:type="dxa"/>
+              <w:bottom w:w="240" w:type="dxa"/>
+              <w:right w:w="0" w:type="dxa"/>
+            </w:tcMar>
+            <w:vAlign w:val="center"/>
+            <w:hideMark/>
+          </w:tcPr>
+          <w:p>
+            <w:r>
+              <w:rPr>
+                <w:b/>
+                <w:bCs/>
+              </w:rPr>
+              <w:t>Execution Time (Seconds)</w:t>
+            </w:r>
+          </w:p>
+        </w:tc>
+      </w:tr>
+      <w:tr>
+        <w:trPr>
+          <w:tblCellSpacing w:w="15" w:type="dxa"/>
+        </w:trPr>
+        <w:tc>
+          <w:tcPr>
+            <w:tcW w:w="0" w:type="auto"/>
+            <w:tcBorders>
+              <w:top w:val="single" w:sz="6" w:space="0" w:color="auto"/>
+              <w:left w:val="single" w:sz="6" w:space="0" w:color="auto"/>
+              <w:bottom w:val="single" w:sz="6" w:space="0" w:color="auto"/>
+              <w:right w:val="single" w:sz="6" w:space="0" w:color="auto"/>
+            </w:tcBorders>
+            <w:tcMar>
+              <w:top w:w="240" w:type="dxa"/>
+              <w:left w:w="0" w:type="dxa"/>
+              <w:bottom w:w="240" w:type="dxa"/>
+              <w:right w:w="180" w:type="dxa"/>
+            </w:tcMar>
+            <w:vAlign w:val="center"/>
+            <w:hideMark/>
+          </w:tcPr>
+          <w:p>
+            <w:r>
+              <w:t>10%</w:t>
+            </w:r>
+          </w:p>
+        </w:tc>
+        <w:tc>
+          <w:tcPr>
+            <w:tcW w:w="0" w:type="auto"/>
+            <w:tcBorders>
+              <w:top w:val="single" w:sz="6" w:space="0" w:color="auto"/>
+              <w:left w:val="single" w:sz="6" w:space="0" w:color="auto"/>
+              <w:bottom w:val="single" w:sz="6" w:space="0" w:color="auto"/>
+              <w:right w:val="single" w:sz="6" w:space="0" w:color="auto"/>
+            </w:tcBorders>
+            <w:tcMar>
+              <w:top w:w="240" w:type="dxa"/>
+              <w:left w:w="0" w:type="dxa"/>
+              <w:bottom w:w="240" w:type="dxa"/>
+              <w:right w:w="180" w:type="dxa"/>
+            </w:tcMar>
+            <w:vAlign w:val="center"/>
+            <w:hideMark/>
+          </w:tcPr>
+          <w:p>
+            <w:r>
+              <w:t>28 steps</w:t>
+            </w:r>
+          </w:p>
+        </w:tc>
+        <w:tc>
+          <w:tcPr>
+            <w:tcW w:w="0" w:type="auto"/>
+            <w:tcBorders>
+              <w:top w:val="single" w:sz="6" w:space="0" w:color="auto"/>
+              <w:left w:val="single" w:sz="6" w:space="0" w:color="auto"/>
+              <w:bottom w:val="single" w:sz="6" w:space="0" w:color="auto"/>
+              <w:right w:val="single" w:sz="6" w:space="0" w:color="auto"/>
+            </w:tcBorders>
+            <w:tcMar>
+              <w:top w:w="240" w:type="dxa"/>
+              <w:left w:w="0" w:type="dxa"/>
+              <w:bottom w:w="240" w:type="dxa"/>
+              <w:right w:w="0" w:type="dxa"/>
+            </w:tcMar>
+            <w:vAlign w:val="center"/>
+            <w:hideMark/>
+          </w:tcPr>
+          <w:p>
+            <w:r>
+              <w:t>0.00115</w:t>
+            </w:r>
+          </w:p>
+        </w:tc>
+      </w:tr>
+      <w:tr>
+        <w:trPr>
+          <w:tblCellSpacing w:w="15" w:type="dxa"/>
+        </w:trPr>
+        <w:tc>
+          <w:tcPr>
+            <w:tcW w:w="0" w:type="auto"/>
+            <w:tcBorders>
+              <w:top w:val="single" w:sz="6" w:space="0" w:color="auto"/>
+              <w:left w:val="single" w:sz="6" w:space="0" w:color="auto"/>
+              <w:bottom w:val="single" w:sz="6" w:space="0" w:color="auto"/>
+              <w:right w:val="single" w:sz="6" w:space="0" w:color="auto"/>
+            </w:tcBorders>
+            <w:tcMar>
+              <w:top w:w="240" w:type="dxa"/>
+              <w:left w:w="0" w:type="dxa"/>
+              <w:bottom w:w="240" w:type="dxa"/>
+              <w:right w:w="180" w:type="dxa"/>
+            </w:tcMar>
+            <w:vAlign w:val="center"/>
+            <w:hideMark/>
+          </w:tcPr>
+          <w:p>
+            <w:r>
+              <w:t>20%</w:t>
+            </w:r>
+          </w:p>
+        </w:tc>
+        <w:tc>
+          <w:tcPr>
+            <w:tcW w:w="0" w:type="auto"/>
+            <w:tcBorders>
+              <w:top w:val="single" w:sz="6" w:space="0" w:color="auto"/>
+              <w:left w:val="single" w:sz="6" w:space="0" w:color="auto"/>
+              <w:bottom w:val="single" w:sz="6" w:space="0" w:color="auto"/>
+              <w:right w:val="single" w:sz="6" w:space="0" w:color="auto"/>
+            </w:tcBorders>
+            <w:tcMar>
+              <w:top w:w="240" w:type="dxa"/>
+              <w:left w:w="0" w:type="dxa"/>
+              <w:bottom w:w="240" w:type="dxa"/>
+              <w:right w:w="180" w:type="dxa"/>
+            </w:tcMar>
+            <w:vAlign w:val="center"/>
+            <w:hideMark/>
+          </w:tcPr>
+          <w:p>
+            <w:r>
+              <w:t>28 steps</w:t>
+            </w:r>
+          </w:p>
+        </w:tc>
+        <w:tc>
+          <w:tcPr>
+            <w:tcW w:w="0" w:type="auto"/>
+            <w:tcBorders>
+              <w:top w:val="single" w:sz="6" w:space="0" w:color="auto"/>
+              <w:left w:val="single" w:sz="6" w:space="0" w:color="auto"/>
+              <w:bottom w:val="single" w:sz="6" w:space="0" w:color="auto"/>
+              <w:right w:val="single" w:sz="6" w:space="0" w:color="auto"/>
+            </w:tcBorders>
+            <w:tcMar>
+              <w:top w:w="240" w:type="dxa"/>
+              <w:left w:w="0" w:type="dxa"/>
+              <w:bottom w:w="240" w:type="dxa"/>
+              <w:right w:w="0" w:type="dxa"/>
+            </w:tcMar>
+            <w:vAlign w:val="center"/>
+            <w:hideMark/>
+          </w:tcPr>
+          <w:p>
+            <w:r>
+              <w:t>0.00049</w:t>
+            </w:r>
+          </w:p>
+        </w:tc>
+      </w:tr>
+      <w:tr>
+        <w:trPr>
+          <w:tblCellSpacing w:w="15" w:type="dxa"/>
+        </w:trPr>
+        <w:tc>
+          <w:tcPr>
+            <w:tcW w:w="0" w:type="auto"/>
+            <w:tcBorders>
+              <w:top w:val="single" w:sz="6" w:space="0" w:color="auto"/>
+              <w:left w:val="single" w:sz="6" w:space="0" w:color="auto"/>
+              <w:bottom w:val="single" w:sz="6" w:space="0" w:color="auto"/>
+              <w:right w:val="single" w:sz="6" w:space="0" w:color="auto"/>
+            </w:tcBorders>
+            <w:tcMar>
+              <w:top w:w="240" w:type="dxa"/>
+              <w:left w:w="0" w:type="dxa"/>
+              <w:bottom w:w="240" w:type="dxa"/>
+              <w:right w:w="180" w:type="dxa"/>
+            </w:tcMar>
+            <w:vAlign w:val="center"/>
+            <w:hideMark/>
+          </w:tcPr>
+          <w:p>
+            <w:r>
+              <w:lastRenderedPageBreak/>
+              <w:t>30%</w:t>
+            </w:r>
+          </w:p>
+        </w:tc>
+        <w:tc>
+          <w:tcPr>
+            <w:tcW w:w="0" w:type="auto"/>
+            <w:tcBorders>
+              <w:top w:val="single" w:sz="6" w:space="0" w:color="auto"/>
+              <w:left w:val="single" w:sz="6" w:space="0" w:color="auto"/>
+              <w:bottom w:val="single" w:sz="6" w:space="0" w:color="auto"/>
+              <w:right w:val="single" w:sz="6" w:space="0" w:color="auto"/>
+            </w:tcBorders>
+            <w:tcMar>
+              <w:top w:w="240" w:type="dxa"/>
+              <w:left w:w="0" w:type="dxa"/>
+              <w:bottom w:w="240" w:type="dxa"/>
+              <w:right w:w="180" w:type="dxa"/>
+            </w:tcMar>
+            <w:vAlign w:val="center"/>
+            <w:hideMark/>
+          </w:tcPr>
+          <w:p>
+            <w:r>
+              <w:t>No Path Found</w:t>
+            </w:r>
+          </w:p>
+        </w:tc>
+        <w:tc>
+          <w:tcPr>
+            <w:tcW w:w="0" w:type="auto"/>
+            <w:tcBorders>
+              <w:top w:val="single" w:sz="6" w:space="0" w:color="auto"/>
+              <w:left w:val="single" w:sz="6" w:space="0" w:color="auto"/>
+              <w:bottom w:val="single" w:sz="6" w:space="0" w:color="auto"/>
+              <w:right w:val="single" w:sz="6" w:space="0" w:color="auto"/>
+            </w:tcBorders>
+            <w:tcMar>
+              <w:top w:w="240" w:type="dxa"/>
+              <w:left w:w="0" w:type="dxa"/>
+              <w:bottom w:w="240" w:type="dxa"/>
+              <w:right w:w="0" w:type="dxa"/>
+            </w:tcMar>
+            <w:vAlign w:val="center"/>
+            <w:hideMark/>
+          </w:tcPr>
+          <w:p>
+            <w:r>
+              <w:t>0.00076</w:t>
+            </w:r>
+          </w:p>
+        </w:tc>
+      </w:tr>
+    </w:tbl>
+    <w:p>
+      <w:pPr>
         <w:rPr>
           <w:b/>
           <w:bCs/>
         </w:rPr>
-        <w:t>Density 10%:</w:t>
-      </w:r>
-      <w:r>
-        <w:t xml:space="preserve"> Path Length = 28 steps, Time = 0.00115 seconds</w:t>
-      </w:r>
-    </w:p>
-    <w:p>
-      <w:pPr>
-        <w:numPr>
-          <w:ilvl w:val="0"/>
-          <w:numId w:val="41"/>
-        </w:numPr>
-      </w:pPr>
+      </w:pPr>
+    </w:p>
+    <w:p>
       <w:r>
         <w:rPr>
           <w:b/>
           <w:bCs/>
         </w:rPr>
-        <w:t>Density 20%:</w:t>
-      </w:r>
-      <w:r>
-        <w:t xml:space="preserve"> Path Length = 28 steps, Time = 0.00049 seconds</w:t>
-      </w:r>
-    </w:p>
-    <w:p>
-      <w:pPr>
-        <w:numPr>
-          <w:ilvl w:val="0"/>
-          <w:numId w:val="41"/>
-        </w:numPr>
-      </w:pPr>
-      <w:r>
-        <w:rPr>
-          <w:b/>
-          <w:bCs/>
-        </w:rPr>
-        <w:t>Density 30%:</w:t>
-      </w:r>
-      <w:r>
-        <w:t xml:space="preserve"> Path Length = No Path Found, Time = 0.00076 seconds</w:t>
-      </w:r>
-    </w:p>
-    <w:p>
-      <w:r>
-        <w:rPr>
-          <w:b/>
-          <w:bCs/>
-        </w:rPr>
         <w:t>6.4 Aggregated Data Analysis</w:t>
       </w:r>
     </w:p>
     <w:p>
       <w:r>
-        <w:t>As the experimental data illustrates, the optimal path length scales linearly with the grid dimensions. However, the execution time scales exponentially as the state space expands or as obstacle density forces the algorithm to evaluate deeper paths. Observing this exponential leap on a grid with only a single agent highlights exactly why standard search algorithms fail when dozens of agents are introduced.</w:t>
-      </w:r>
-    </w:p>
-    <w:p>
-      <w:r>
-        <w:lastRenderedPageBreak/>
-        <w:t>The branching factor of the high-level constraint tree in a dense multi-agent scenario will cause an unsustainable memory overhead. This empirical data confirms the absolute necessity of the final phase of my project. Implementing the custom h-CBS heuristic will be strictly required to aggressively prune the constraint tree and manage computation times in these dense, high-obstacle warehouse simulations.</w:t>
+        <w:t>As the experimental data illustrates, the optimal path length scales linearly with the grid dimensions. However, the execution time scales exponentially as the state space expands. Observing this exponential leap on a grid with only a single agent highlights exactly why standard search algorithms fail when dozens of agents are introduced. The branching factor of the high-level constraint tree in a dense multi-agent scenario will cause an unsustainable memory overhead.</w:t>
+      </w:r>
+    </w:p>
+    <w:p>
+      <w:r>
+        <w:t xml:space="preserve">Furthermore, the Obstacle Density experiment (Experiment 3 and Table 1) revealed critical environmental constraints. Interestingly, the execution time slightly decreased at 20% density compared to 10%; this is a known phenomenon where increased obstacles act as a pruning mechanism, restricting the number of valid orthogonal </w:t>
+      </w:r>
+      <w:proofErr w:type="spellStart"/>
+      <w:r>
+        <w:t>neighbors</w:t>
+      </w:r>
+      <w:proofErr w:type="spellEnd"/>
+      <w:r>
+        <w:t xml:space="preserve"> A* must evaluate. However, at a critical threshold of 30% density, the algorithm failed to find a valid path entirely, as the random distribution of obstacles created an impassable barrier between the start and goal states.</w:t>
+      </w:r>
+    </w:p>
+    <w:p>
+      <w:r>
+        <w:t>This empirical data confirms the absolute necessity of the final phase of my project. Integrating standard heuristics into the high-level tree transforms CBS from a blind constraint search into an informed, heuristic-driven search [8], which will be strictly required to manage computation times. Furthermore, future experiments must account for intelligent pallet distribution to prevent the "No Path Found" deadlocks observed in high-density grid setups.</w:t>
       </w:r>
     </w:p>
     <w:p>
@@ -2127,11 +2659,19 @@
       </w:r>
       <w:proofErr w:type="spellStart"/>
       <w:r>
-        <w:t>find_conflicts</w:t>
+        <w:t>find_</w:t>
+      </w:r>
+      <w:proofErr w:type="gramStart"/>
+      <w:r>
+        <w:t>conflicts</w:t>
       </w:r>
       <w:proofErr w:type="spellEnd"/>
       <w:r>
-        <w:t>() logic to detect multi-agent Vertex and Edge collisions.</w:t>
+        <w:t>(</w:t>
+      </w:r>
+      <w:proofErr w:type="gramEnd"/>
+      <w:r>
+        <w:t>) logic to detect multi-agent Vertex and Edge collisions.</w:t>
       </w:r>
     </w:p>
     <w:p>
@@ -2146,6 +2686,7 @@
           <w:b/>
           <w:bCs/>
         </w:rPr>
+        <w:lastRenderedPageBreak/>
         <w:t>Week 15:</w:t>
       </w:r>
       <w:r>
@@ -2218,6 +2759,92 @@
           <w:t>https://github.com/itsdishank/MAPF_Project</w:t>
         </w:r>
       </w:hyperlink>
+    </w:p>
+    <w:p>
+      <w:pPr>
+        <w:rPr>
+          <w:b/>
+          <w:bCs/>
+        </w:rPr>
+      </w:pPr>
+    </w:p>
+    <w:p>
+      <w:pPr>
+        <w:rPr>
+          <w:b/>
+          <w:bCs/>
+        </w:rPr>
+      </w:pPr>
+      <w:r>
+        <w:rPr>
+          <w:b/>
+          <w:bCs/>
+        </w:rPr>
+        <w:t>9. References</w:t>
+      </w:r>
+    </w:p>
+    <w:p>
+      <w:r>
+        <w:t xml:space="preserve">[1] S. Russell and P. Norvig, Artificial Intelligence: A Modern Approach, 4th ed. Pearson, 2020. </w:t>
+      </w:r>
+      <w:r>
+        <w:br/>
+      </w:r>
+      <w:r>
+        <w:t xml:space="preserve">[2] P. R. Wurman, R. D'Andrea, and M. Mountz, "Coordinating Hundreds of Cooperative, Autonomous Vehicles in Warehouses," AI Magazine, vol. 29, no. 1, pp. 9-20, 2008. </w:t>
+      </w:r>
+      <w:r>
+        <w:br/>
+      </w:r>
+      <w:r>
+        <w:t xml:space="preserve">[3] D. Silver, "Cooperative Pathfinding," in Proceedings of Artificial Intelligence and Interactive Digital Entertainment (AIIDE), 2005, pp. 117-122. </w:t>
+      </w:r>
+      <w:r>
+        <w:br/>
+      </w:r>
+      <w:r>
+        <w:t xml:space="preserve">[4] T. </w:t>
+      </w:r>
+      <w:proofErr w:type="spellStart"/>
+      <w:r>
+        <w:t>Standley</w:t>
+      </w:r>
+      <w:proofErr w:type="spellEnd"/>
+      <w:r>
+        <w:t xml:space="preserve">, "Finding Optimal Solutions to Cooperative Pathfinding Problems," in Proceedings of the AAAI Conference on Artificial Intelligence, 2010, pp. 173-178. </w:t>
+      </w:r>
+      <w:r>
+        <w:br/>
+      </w:r>
+      <w:r>
+        <w:t xml:space="preserve">[5] G. Sharon, R. Stern, A. Felner, and N. R. Sturtevant, "Conflict-based search for optimal multi-agent pathfinding," Artificial Intelligence, vol. 219, pp. 40-66, 2015. </w:t>
+      </w:r>
+      <w:r>
+        <w:br/>
+      </w:r>
+      <w:r>
+        <w:t>[6] R. Stern et al., "Multi-Agent Pathfinding: Definitions, Variants, and Benchmarks," in Symposium on Combinatorial Search (</w:t>
+      </w:r>
+      <w:proofErr w:type="spellStart"/>
+      <w:r>
+        <w:t>SoCS</w:t>
+      </w:r>
+      <w:proofErr w:type="spellEnd"/>
+      <w:r>
+        <w:t xml:space="preserve">), 2019. </w:t>
+      </w:r>
+      <w:r>
+        <w:br/>
+      </w:r>
+      <w:r>
+        <w:t xml:space="preserve">[7] H. Ma, J. Li, T. K. Satish Kumar, and S. Koenig, "Lifelong Multi-Agent Path Finding for Online Pickup and Delivery Tasks," in Proceedings of AAMAS, 2017. </w:t>
+      </w:r>
+      <w:r>
+        <w:br/>
+      </w:r>
+      <w:r>
+        <w:t>[8] A. Felner et al., "Adding Heuristics to Conflict-Based Search for Multi-Agent Path Finding," in International Conference on Automated Planning and Scheduling (ICAPS), 2018.</w:t>
+      </w:r>
     </w:p>
     <w:p/>
     <w:sectPr>
@@ -8596,7 +9223,6 @@
     <w:next w:val="Normal"/>
     <w:link w:val="Heading3Char"/>
     <w:uiPriority w:val="9"/>
-    <w:semiHidden/>
     <w:unhideWhenUsed/>
     <w:qFormat/>
     <w:rsid w:val="00D777D6"/>
@@ -8803,7 +9429,6 @@
     <w:basedOn w:val="DefaultParagraphFont"/>
     <w:link w:val="Heading3"/>
     <w:uiPriority w:val="9"/>
-    <w:semiHidden/>
     <w:rsid w:val="00D777D6"/>
     <w:rPr>
       <w:rFonts w:eastAsiaTheme="majorEastAsia" w:cstheme="majorBidi"/>
@@ -9128,6 +9753,17 @@
       <w:shd w:val="clear" w:color="auto" w:fill="E1DFDD"/>
     </w:rPr>
   </w:style>
+  <w:style w:type="paragraph" w:styleId="NormalWeb">
+    <w:name w:val="Normal (Web)"/>
+    <w:basedOn w:val="Normal"/>
+    <w:uiPriority w:val="99"/>
+    <w:semiHidden/>
+    <w:unhideWhenUsed/>
+    <w:rsid w:val="0004232A"/>
+    <w:rPr>
+      <w:rFonts w:ascii="Times New Roman" w:hAnsi="Times New Roman" w:cs="Times New Roman"/>
+    </w:rPr>
+  </w:style>
 </w:styles>
 </file>
 

</xml_diff>